<commit_message>
hub doc 54: as-built de la ENTREGA A de UST-19 (27-sep 00:40, po258): fila a fila C1–C8, lecciones r27-e, cadena; PDF/Word sin firma = as-built (firma pendiente); la propuesta v2 firmada se conserva como -v2-propuesta.pdf (huella 996b…); tarjeta del índice
</commit_message>
<xml_diff>
--- a/_integration/docs/ust/UST-2026-09-26-19-alta-publica-blindada.docx
+++ b/_integration/docs/ust/UST-2026-09-26-19-alta-publica-blindada.docx
@@ -63,7 +63,7 @@
           <w:sz w:val="20"/>
           <w:szCs w:val="20"/>
         </w:rPr>
-        <w:t xml:space="preserve">PROPUESTA VALIDADA EN PARTE · alcance dado por Juanjo en el chat (26-sep: «2+3+4+5+7» y, al leer la propuesta, «hay que meter también 6» → las SEIS capas: 2+3+4+5+6+7) · D1–D10 y D14 DECIDIDOS por Juanjo (26-sep: «D1 a D9, se implementan según las recomendaciones, no alternativas» · «D10 y D14 según recomendaciones») · D11–D13 → firma de Pilar y Lucía (🗳 WL-2). Nada construido. Lo que se afirma está leído del código (repos/web2/src/js/30-forms.js, tools/patches/waitlist.py, integrate.py ns-waitlist-js, Edge community-lead) o medido en la base el 26-sep. La capa 6 (doble opt-in) toca qué guardamos y cuánto tiempo → carril producto: la firman Pilar y Lucía (🗳 WL-2, D11–D13).</w:t>
+        <w:t xml:space="preserve">ENTREGA A DESPLEGADA (as-built del 27-sep 00:40 EEST, Juanjo ejecutando en el orden C8/D10) · propuesta v2 firmada por Juanjo el 26-sep (D1–D10 y D14) · entrega B (capa 6, D11–D13) bloqueada por 🗳 WL-2 (Pilar y Lucía). Lo que se afirma abajo está medido en producción durante el despliegue (veredictos en vivo, smoke, sondas de solo lectura) o leído del código desplegado (po258, ns-build 2709-002539). Firma del as-built: pendiente.</w:t>
       </w:r>
     </w:p>
     <w:p>
@@ -846,7 +846,7 @@
           <w:sz w:val="30"/>
           <w:szCs w:val="30"/>
         </w:rPr>
-        <w:t xml:space="preserve">3 · Cambios, fila a fila (propuesta)</w:t>
+        <w:t xml:space="preserve">3 · Cambios, fila a fila (propuesta → as-built de la entrega A, 27-sep; C9–C10 = entrega B, tras WL-2)</w:t>
       </w:r>
     </w:p>
     <w:tbl>
@@ -951,7 +951,7 @@
                 <w:sz w:val="16"/>
                 <w:szCs w:val="16"/>
               </w:rPr>
-              <w:t xml:space="preserve">Cómo se verificará</w:t>
+              <w:t xml:space="preserve">Cómo se verificará / cómo se verificó (as-built)</w:t>
             </w:r>
           </w:p>
         </w:tc>
@@ -1037,7 +1037,7 @@
                 <w:sz w:val="16"/>
                 <w:szCs w:val="16"/>
               </w:rPr>
-              <w:t xml:space="preserve">Arnés de funciones puras (transpilar con el `typescript` de appdev, como community-lead) para: lista blanca de source, honeypot, tiempo mínimo, forma del hash de IP. Estreno REAL con una llamada por cada camino (r21): fetch OK · sin JS 303 · honeypot 200-sin-fila · sin gateway 403 · Turnstile inválido 400 · duplicado 409.</w:t>
+              <w:t xml:space="preserve">Arnés de funciones puras (transpilar con el `typescript` de appdev, como community-lead) para: lista blanca de source, honeypot, tiempo mínimo, forma del hash de IP. Estreno REAL con una llamada por cada camino (r21): fetch OK · sin JS 303 · honeypot 200-sin-fila · sin gateway 403 · Turnstile inválido 400 · duplicado 409. ▶ AS-BUILT 27-sep: desplegada 00:20 (edge-tests 9/9 · secretos NS_GATEWAY_SECRET y TURNSTILE_SECRET subidos con el fichero entero). Veredicto en vivo, 5 caminos: 403 gateway · 200 honeypot (nada guardado) · 400 email · 400 Turnstile inválido · 400 too-fast — ninguno crea filas. DESVIACIÓN: el 1er veredicto calculaba t0 antes de los 4 curls y con la función en frío pasaron &gt;2 s: la función hizo lo correcto (201, y de paso probó el camino feliz entero) y creó UNA fila rapida-…@example.invalid → borrada (SQL con guarda de recuento) y test corregido (t0 justo antes del curl + token Turnstile inválido como red: ya no puede crear filas). Y npx --yes en los .command: el prompt «Ok to proceed?» escondido en /dev/null parecía un cuelgue.</w:t>
             </w:r>
           </w:p>
         </w:tc>
@@ -1123,7 +1123,7 @@
                 <w:sz w:val="16"/>
                 <w:szCs w:val="16"/>
               </w:rPr>
-              <w:t xml:space="preserve">Fichero con `begin/commit`, autoprueba (`set local role anon` → INSERT = 42501 permission denied) y verificación final. Arnés PG16 antes de la bandeja. Se ejecuta EL ÚLTIMO (D10): cuando la web ya envía por la puerta nueva.</w:t>
+              <w:t xml:space="preserve">Fichero con `begin/commit`, autoprueba (`set local role anon` → INSERT = 42501 permission denied) y verificación final. Arnés PG16 antes de la bandeja. Se ejecuta EL ÚLTIMO (D10): cuando la web ya envía por la puerta nueva. ▶ AS-BUILT 27-sep: ritmo aplicado 23:2x (true·0 · false·false·true · reglas puras rojo/verde · autoprueba) · REST cerrado 00:35 (policy «anyone can join waitlist» fuera + revoke insert anon; autopruebas anon 42501 / service_role entra; smoke: POST anónimo → 401). Las 8 policies de admins (waitlist_admin_* + «admins … waitlist») intactas (sonda 2026-09-27-sonda-waitlist-policies.sql). DESVIACIÓN de método: la verificación buscaba una policy con nombre inventado («admins * waitlist», abreviatura de la memoria) y dio 0 → corregida a los nombres reales. anon conserva grants sobrantes (select/update/delete/truncate…): RLS los tapa; retirarlos es item de S20.</w:t>
             </w:r>
           </w:p>
         </w:tc>
@@ -1209,7 +1209,7 @@
                 <w:sz w:val="16"/>
                 <w:szCs w:val="16"/>
               </w:rPr>
-              <w:t xml:space="preserve">web-tests: el módulo se ejecuta en vm con peticiones de forma (JSON, form, honeypot) contra una Edge falsa. smoke-prod: `POST /api/waitlist` con honeypot → 200 `{ok:true}` y `waitlist_count` NO cambia.</w:t>
+              <w:t xml:space="preserve">web-tests: el módulo se ejecuta en vm con peticiones de forma (JSON, form, honeypot) contra una Edge falsa. smoke-prod: `POST /api/waitlist` con honeypot → 200 `{ok:true}` y `waitlist_count` NO cambia. ▶ AS-BUILT 27-sep: functions/api/waitlist.js con UNA fuente (repos/web2/functions/api/, copiada byte a byte por integrate ns-web2-api) · publish/_routes.json = «/», /hub, /hub/*, /api/* con fuente en _integration · NS_GATEWAY como Secret en las dos Pages (nutrisync-collective y nutrisync-web2; entra en vigor con el siguiente deploy, y la Function responde 503 gateway-unconfigured hasta entonces) · web-tests ejecuta la Function contra una Edge falsa (94→95 tests). DESVIACIÓN: el bloque ns-web2-api de integrate.py quedó pegado DENTRO del string de _headers (nunca corría y salía como texto en publish/_headers): se vio al integrar po258, se movió tras ns-web2-root y hay test nuevo (web r27-e: gramática de _headers/_redirects).</w:t>
             </w:r>
           </w:p>
         </w:tc>
@@ -1295,7 +1295,7 @@
                 <w:sz w:val="16"/>
                 <w:szCs w:val="16"/>
               </w:rPr>
-              <w:t xml:space="preserve">Prueba con `ab`/bucle de curl desde el Mac: la 11ª petición en 10 s devuelve 429 de Cloudflare; la Edge no la ve.</w:t>
+              <w:t xml:space="preserve">Prueba con `ab`/bucle de curl desde el Mac: la 11ª petición en 10 s devuelve 429 de Cloudflare; la Edge no la ve. ▶ AS-BUILT 27-sep: regla «waitlist api 10/10s» creada por Juanjo (Security → Security rules → Rate limiting): URI Path eq /api/waitlist · misma IP · 10 peticiones · ventana de 10 s (la fija del plan Free) · Block 10 s. Bot Fight Mode NO (D6).</w:t>
             </w:r>
           </w:p>
         </w:tc>
@@ -1381,7 +1381,7 @@
                 <w:sz w:val="16"/>
                 <w:szCs w:val="16"/>
               </w:rPr>
-              <w:t xml:space="preserve">Capturas ES/EN × 390/1440 (textfit no debe cambiar: el widget va debajo del botón). En vivo: alta con token válido → 201; sin token con JS → 400 «verificación pendiente»; sin JS → camino C1 con límite estricto.</w:t>
+              <w:t xml:space="preserve">Capturas ES/EN × 390/1440 (textfit no debe cambiar: el widget va debajo del botón). En vivo: alta con token válido → 201; sin token con JS → 400 «verificación pendiente»; sin JS → camino C1 con límite estricto. ▶ AS-BUILT 27-sep: widget «NutriSync web» (Managed) con hostnames nutrisynccollective.com · v2.nutrisynccollective.com · nutrisync-web2.pages.dev; site key en repos/web2/src/turnstile.json (pública; vacía = sin widget), secret solo en secrets/edge-functions.env → supabase secrets. Modo explicit + execution «execute» + appearance «interaction-only»: se ejecuta al pulsar Join, invisible salvo reto, 6 s sin token → camino estricto (D4). El contenedor .ns-ts queda exento de ns-deco en build.py (el reto hay que poder pulsarlo). Alta real de Juanjo desde v2.: sin reto visible y waitlist_ritmo.verificado = true (siteverify aceptó el token). Lista blanca declarada en verify-web2 (B), pre-deploy bloque 7 y smoke.</w:t>
             </w:r>
           </w:p>
         </w:tc>
@@ -1467,7 +1467,7 @@
                 <w:sz w:val="16"/>
                 <w:szCs w:val="16"/>
               </w:rPr>
-              <w:t xml:space="preserve">verify-web2 + textfit en 5 idiomas × 2 anchos · candidata `v2.` verificada por Juanjo (circuito de 5 pasos, «sin 2 y 3 no hay 4 o 5») · web-tests (snippet `ns-waitlist-js` real en vm).</w:t>
+              <w:t xml:space="preserve">verify-web2 + textfit en 5 idiomas × 2 anchos · candidata `v2.` verificada por Juanjo (circuito de 5 pasos, «sin 2 y 3 no hay 4 o 5») · web-tests (snippet `ns-waitlist-js` real en vm). ▶ AS-BUILT 27-sep: web2 build 2709-001156 (forms-test 11/11 en jsdom: POST same-origin a /api/waitlist con X-NS-Fetch, JSON completo, sin anon key; 201/409/429/400 pintan su mensaje; sin consentimiento no se envía; ?waitlist= tras POST sin JS) → candidata 00:12 → verificada 00:22 por Juanjo (alta real → aparece en 📬) → integrate → po258 00:32 (raíz + /v1/ con ns-waitlist-js refresh-on-change). Las 5 páginas de la V2 cargan el bundle nuevo; 4 bundles huérfanos de builds anteriores (uno con el POST viejo) siguen en publish/assets sin que nadie los referencie → item de backlog. Copy «You’re in! Check your inbox» (heredado de UST-07): no sale correo hasta la entrega B → dentro del item B.</w:t>
             </w:r>
           </w:p>
         </w:tc>
@@ -1553,7 +1553,7 @@
                 <w:sz w:val="16"/>
                 <w:szCs w:val="16"/>
               </w:rPr>
-              <w:t xml:space="preserve">Estreno con una llamada real a la Edge (mirar el cuerpo, r16/r20). Arnés: sembrar 60 altas en 24 h → aparece el ⚠.</w:t>
+              <w:t xml:space="preserve">Estreno con una llamada real a la Edge (mirar el cuerpo, r16/r20). Arnés: sembrar 60 altas en 24 h → aparece el ⚠. ▶ AS-BUILT 27-sep: founder_pending_summary v4 aplicada (true · waitlist = 1 · 3 · 169 · false · las 6 secciones siguen) · founder-reminders desplegada 00:38 (sin modo prueba: la línea «📬 LISTA DE ESPERA: +N en 24 h · +N en 7 días · total T» se comprueba en el digest del 27-sep 07:15 UTC). DESVIACIÓN de método: la verificación del SQL tenía un error de precedencia (text -&gt;&gt; unknown) que saltó DESPUÉS de aplicar la función; corregida con paréntesis.</w:t>
             </w:r>
           </w:p>
         </w:tc>
@@ -1639,7 +1639,7 @@
                 <w:sz w:val="16"/>
                 <w:szCs w:val="16"/>
               </w:rPr>
-              <w:t xml:space="preserve">Cada paso con su comprobación antes del siguiente (regla 7-sep: validar antes de sobreescribir). Baseline antes del paso 1.</w:t>
+              <w:t xml:space="preserve">Cada paso con su comprobación antes del siguiente (regla 7-sep: validar antes de sobreescribir). Baseline antes del paso 1. ▶ AS-BUILT 27-sep: orden cumplido: ritmo 23:2x → secretos + Edge 00:20 → NS_GATEWAY + Turnstile + WAF → candidata 00:12 (se desplegó antes que la Edge: sin efecto, la Function devolvía 503/gateway hasta tenerla) → verificada 00:22 → integrate + po258 00:32 (pre-deploy 8b: candidata registrada + verificada + viva) → smoke (200 honeypot · REST 400) → cierre REST 00:35 → smoke (REST 401) → vigilancia 00:37 → founder-reminders 00:38. Baseline previa: archive/logs/baseline-20260926-233502.txt. ROLLBACK del REST escrito antes (-cerrar-rest-ROLLBACK.sql), no hizo falta.</w:t>
             </w:r>
           </w:p>
         </w:tc>
@@ -1725,7 +1725,7 @@
                 <w:sz w:val="16"/>
                 <w:szCs w:val="16"/>
               </w:rPr>
-              <w:t xml:space="preserve">Arnés PG16: la purga y `waitlist_count` con filas confirmadas/pendientes/caducadas. Estreno REAL (r21/r20): un alta propia → el cron (o una llamada manual `x-ns-cron` con `lote:1`) envía UN correo → se mira en la bandeja → clic → `confirmed_at` sellado y la Home sube en 1. Un token repetido → «ya confirmado»; uno inventado → «enlace no válido». Nunca ráfagas de prueba (quema cuota).</w:t>
+              <w:t xml:space="preserve">Arnés PG16: la purga y `waitlist_count` con filas confirmadas/pendientes/caducadas. Estreno REAL (r21/r20): un alta propia → el cron (o una llamada manual `x-ns-cron` con `lote:1`) envía UN correo → se mira en la bandeja → clic → `confirmed_at` sellado y la Home sube en 1. Un token repetido → «ya confirmado»; uno inventado → «enlace no válido». Nunca ráfagas de prueba (quema cuota). ▶ ENTREGA B: pendiente de 🗳 WL-2 (item propio en backlog, bloqueado por DoR 4).</w:t>
             </w:r>
           </w:p>
         </w:tc>
@@ -1811,7 +1811,7 @@
                 <w:sz w:val="16"/>
                 <w:szCs w:val="16"/>
               </w:rPr>
-              <w:t xml:space="preserve">Arnés: sembrar filas en los cuatro estados (confirmada · pendiente reciente · pendiente &gt; 7 días con envío · pendiente sin envío) → solo se borra la tercera. En producción: la línea del digest del día siguiente.</w:t>
+              <w:t xml:space="preserve">Arnés: sembrar filas en los cuatro estados (confirmada · pendiente reciente · pendiente &gt; 7 días con envío · pendiente sin envío) → solo se borra la tercera. En producción: la línea del digest del día siguiente. ▶ ENTREGA B: pendiente de 🗳 WL-2 (item propio en backlog, bloqueado por DoR 4).</w:t>
             </w:r>
           </w:p>
         </w:tc>
@@ -4485,6 +4485,65 @@
                 <w:szCs w:val="16"/>
               </w:rPr>
               <w:t xml:space="preserve">Qué se comprueba</w:t>
+            </w:r>
+          </w:p>
+        </w:tc>
+      </w:tr>
+      <w:tr>
+        <w:trPr>
+          <w:cantSplit/>
+        </w:trPr>
+        <w:tc>
+          <w:tcPr>
+            <w:tcW w:type="dxa" w:w="2266"/>
+            <w:tcMar>
+              <w:top w:type="dxa" w:w="70"/>
+              <w:left w:type="dxa" w:w="100"/>
+              <w:bottom w:type="dxa" w:w="70"/>
+              <w:right w:type="dxa" w:w="100"/>
+            </w:tcMar>
+          </w:tcPr>
+          <w:p>
+            <w:pPr>
+              <w:spacing w:after="40"/>
+            </w:pPr>
+            <w:r>
+              <w:rPr>
+                <w:rFonts w:ascii="Aptos" w:cs="Aptos" w:eastAsia="Aptos" w:hAnsi="Aptos"/>
+                <w:b/>
+                <w:bCs/>
+                <w:color w:val="6B6B6B"/>
+                <w:sz w:val="16"/>
+                <w:szCs w:val="16"/>
+              </w:rPr>
+              <w:t xml:space="preserve">As-built A · lo medido (27-sep 00:40)</w:t>
+            </w:r>
+          </w:p>
+        </w:tc>
+        <w:tc>
+          <w:tcPr>
+            <w:tcW w:type="dxa" w:w="8034"/>
+            <w:tcMar>
+              <w:top w:type="dxa" w:w="70"/>
+              <w:left w:type="dxa" w:w="100"/>
+              <w:bottom w:type="dxa" w:w="70"/>
+              <w:right w:type="dxa" w:w="100"/>
+            </w:tcMar>
+          </w:tcPr>
+          <w:p>
+            <w:pPr>
+              <w:spacing w:after="40"/>
+            </w:pPr>
+            <w:r>
+              <w:rPr>
+                <w:rFonts w:ascii="Aptos" w:cs="Aptos" w:eastAsia="Aptos" w:hAnsi="Aptos"/>
+                <w:b w:val="false"/>
+                <w:bCs w:val="false"/>
+                <w:color w:val="6B6B6B"/>
+                <w:sz w:val="16"/>
+                <w:szCs w:val="16"/>
+              </w:rPr>
+              <w:t xml:space="preserve">Edge: 5 caminos en vivo sin filas · SQL: ritmo (true·0 / false·false·true) · REST cerrado (0 policies INSERT anon · anon insert false · service_role true · 8 policies de admins) · web: pre-deploy todo verde, web-tests 95/95, smoke PRODUCCIÓN SANA con /api/waitlist → 200 honeypot y POST anónimo REST → 401 · digest v4 (true · 1·3·169·false) · Turnstile: alta real con verificado=true · waitlist: 169 vivas (168 + Juanjo). Pendiente humano: digest del 27-sep 07:15 con la línea 📬; Lucía y Pilar apuntándose desde el móvil (DoD).</w:t>
             </w:r>
           </w:p>
         </w:tc>
@@ -5032,7 +5091,457 @@
           <w:sz w:val="30"/>
           <w:szCs w:val="30"/>
         </w:rPr>
-        <w:t xml:space="preserve">8 · La cadena</w:t>
+        <w:t xml:space="preserve">8 · Lecciones grabadas (van también a CLAUDE.md)</w:t>
+      </w:r>
+    </w:p>
+    <w:tbl>
+      <w:tblPr>
+        <w:tblW w:type="dxa" w:w="10300"/>
+        <w:tblBorders>
+          <w:top w:val="single" w:color="E4DDD8" w:sz="2"/>
+          <w:left w:val="none"/>
+          <w:bottom w:val="single" w:color="E4DDD8" w:sz="2"/>
+          <w:right w:val="none"/>
+          <w:insideH w:val="single" w:color="EFEAE6" w:sz="1"/>
+          <w:insideV w:val="none"/>
+        </w:tblBorders>
+        <w:tblLayout w:type="fixed"/>
+      </w:tblPr>
+      <w:tblGrid>
+        <w:gridCol w:w="2678"/>
+        <w:gridCol w:w="7622"/>
+      </w:tblGrid>
+      <w:tr>
+        <w:trPr>
+          <w:tblHeader/>
+        </w:trPr>
+        <w:tc>
+          <w:tcPr>
+            <w:tcW w:type="dxa" w:w="2678"/>
+            <w:shd w:fill="F7F3F1" w:val="clear"/>
+            <w:tcMar>
+              <w:top w:type="dxa" w:w="70"/>
+              <w:left w:type="dxa" w:w="100"/>
+              <w:bottom w:type="dxa" w:w="70"/>
+              <w:right w:type="dxa" w:w="100"/>
+            </w:tcMar>
+          </w:tcPr>
+          <w:p>
+            <w:pPr>
+              <w:spacing w:after="40"/>
+            </w:pPr>
+            <w:r>
+              <w:rPr>
+                <w:rFonts w:ascii="Aptos" w:cs="Aptos" w:eastAsia="Aptos" w:hAnsi="Aptos"/>
+                <w:b/>
+                <w:bCs/>
+                <w:color w:val="1A1818"/>
+                <w:sz w:val="16"/>
+                <w:szCs w:val="16"/>
+              </w:rPr>
+              <w:t xml:space="preserve">Lección</w:t>
+            </w:r>
+          </w:p>
+        </w:tc>
+        <w:tc>
+          <w:tcPr>
+            <w:tcW w:type="dxa" w:w="7622"/>
+            <w:shd w:fill="F7F3F1" w:val="clear"/>
+            <w:tcMar>
+              <w:top w:type="dxa" w:w="70"/>
+              <w:left w:type="dxa" w:w="100"/>
+              <w:bottom w:type="dxa" w:w="70"/>
+              <w:right w:type="dxa" w:w="100"/>
+            </w:tcMar>
+          </w:tcPr>
+          <w:p>
+            <w:pPr>
+              <w:spacing w:after="40"/>
+            </w:pPr>
+            <w:r>
+              <w:rPr>
+                <w:rFonts w:ascii="Aptos" w:cs="Aptos" w:eastAsia="Aptos" w:hAnsi="Aptos"/>
+                <w:b/>
+                <w:bCs/>
+                <w:color w:val="1A1818"/>
+                <w:sz w:val="16"/>
+                <w:szCs w:val="16"/>
+              </w:rPr>
+              <w:t xml:space="preserve">Qué cambia</w:t>
+            </w:r>
+          </w:p>
+        </w:tc>
+      </w:tr>
+      <w:tr>
+        <w:trPr>
+          <w:cantSplit/>
+        </w:trPr>
+        <w:tc>
+          <w:tcPr>
+            <w:tcW w:type="dxa" w:w="2678"/>
+            <w:tcMar>
+              <w:top w:type="dxa" w:w="70"/>
+              <w:left w:type="dxa" w:w="100"/>
+              <w:bottom w:type="dxa" w:w="70"/>
+              <w:right w:type="dxa" w:w="100"/>
+            </w:tcMar>
+          </w:tcPr>
+          <w:p>
+            <w:pPr>
+              <w:spacing w:after="40"/>
+            </w:pPr>
+            <w:r>
+              <w:rPr>
+                <w:rFonts w:ascii="Aptos" w:cs="Aptos" w:eastAsia="Aptos" w:hAnsi="Aptos"/>
+                <w:b/>
+                <w:bCs/>
+                <w:color w:val="6B6B6B"/>
+                <w:sz w:val="16"/>
+                <w:szCs w:val="16"/>
+              </w:rPr>
+              <w:t xml:space="preserve">Un prompt escondido en /dev/null parece un cuelgue</w:t>
+            </w:r>
+          </w:p>
+        </w:tc>
+        <w:tc>
+          <w:tcPr>
+            <w:tcW w:type="dxa" w:w="7622"/>
+            <w:tcMar>
+              <w:top w:type="dxa" w:w="70"/>
+              <w:left w:type="dxa" w:w="100"/>
+              <w:bottom w:type="dxa" w:w="70"/>
+              <w:right w:type="dxa" w:w="100"/>
+            </w:tcMar>
+          </w:tcPr>
+          <w:p>
+            <w:pPr>
+              <w:spacing w:after="40"/>
+            </w:pPr>
+            <w:r>
+              <w:rPr>
+                <w:rFonts w:ascii="Aptos" w:cs="Aptos" w:eastAsia="Aptos" w:hAnsi="Aptos"/>
+                <w:b w:val="false"/>
+                <w:bCs w:val="false"/>
+                <w:color w:val="6B6B6B"/>
+                <w:sz w:val="16"/>
+                <w:szCs w:val="16"/>
+              </w:rPr>
+              <w:t xml:space="preserve">npx preguntó «Ok to proceed? (y)» con la salida redirigida: 10 minutos de «tarda mucho». Los tres .command que llaman al CLI de Supabase llevan npx --yes.</w:t>
+            </w:r>
+          </w:p>
+        </w:tc>
+      </w:tr>
+      <w:tr>
+        <w:trPr>
+          <w:cantSplit/>
+        </w:trPr>
+        <w:tc>
+          <w:tcPr>
+            <w:tcW w:type="dxa" w:w="2678"/>
+            <w:tcMar>
+              <w:top w:type="dxa" w:w="70"/>
+              <w:left w:type="dxa" w:w="100"/>
+              <w:bottom w:type="dxa" w:w="70"/>
+              <w:right w:type="dxa" w:w="100"/>
+            </w:tcMar>
+          </w:tcPr>
+          <w:p>
+            <w:pPr>
+              <w:spacing w:after="40"/>
+            </w:pPr>
+            <w:r>
+              <w:rPr>
+                <w:rFonts w:ascii="Aptos" w:cs="Aptos" w:eastAsia="Aptos" w:hAnsi="Aptos"/>
+                <w:b/>
+                <w:bCs/>
+                <w:color w:val="6B6B6B"/>
+                <w:sz w:val="16"/>
+                <w:szCs w:val="16"/>
+              </w:rPr>
+              <w:t xml:space="preserve">Un test que puede crear filas en producción no es un test</w:t>
+            </w:r>
+          </w:p>
+        </w:tc>
+        <w:tc>
+          <w:tcPr>
+            <w:tcW w:type="dxa" w:w="7622"/>
+            <w:tcMar>
+              <w:top w:type="dxa" w:w="70"/>
+              <w:left w:type="dxa" w:w="100"/>
+              <w:bottom w:type="dxa" w:w="70"/>
+              <w:right w:type="dxa" w:w="100"/>
+            </w:tcMar>
+          </w:tcPr>
+          <w:p>
+            <w:pPr>
+              <w:spacing w:after="40"/>
+            </w:pPr>
+            <w:r>
+              <w:rPr>
+                <w:rFonts w:ascii="Aptos" w:cs="Aptos" w:eastAsia="Aptos" w:hAnsi="Aptos"/>
+                <w:b w:val="false"/>
+                <w:bCs w:val="false"/>
+                <w:color w:val="6B6B6B"/>
+                <w:sz w:val="16"/>
+                <w:szCs w:val="16"/>
+              </w:rPr>
+              <w:t xml:space="preserve">El veredicto «demasiado rápido» calculó t0 una vez para 4 curls; con la función en frío el alta fue legítima y creó una fila. Ahora t0 va justo antes del curl y todos los caminos que llegan al guardado llevan un token de Turnstile inválido como red: pase lo que pase, 400 y ninguna fila.</w:t>
+            </w:r>
+          </w:p>
+        </w:tc>
+      </w:tr>
+      <w:tr>
+        <w:trPr>
+          <w:cantSplit/>
+        </w:trPr>
+        <w:tc>
+          <w:tcPr>
+            <w:tcW w:type="dxa" w:w="2678"/>
+            <w:tcMar>
+              <w:top w:type="dxa" w:w="70"/>
+              <w:left w:type="dxa" w:w="100"/>
+              <w:bottom w:type="dxa" w:w="70"/>
+              <w:right w:type="dxa" w:w="100"/>
+            </w:tcMar>
+          </w:tcPr>
+          <w:p>
+            <w:pPr>
+              <w:spacing w:after="40"/>
+            </w:pPr>
+            <w:r>
+              <w:rPr>
+                <w:rFonts w:ascii="Aptos" w:cs="Aptos" w:eastAsia="Aptos" w:hAnsi="Aptos"/>
+                <w:b/>
+                <w:bCs/>
+                <w:color w:val="6B6B6B"/>
+                <w:sz w:val="16"/>
+                <w:szCs w:val="16"/>
+              </w:rPr>
+              <w:t xml:space="preserve">Código pegado dentro de un string es texto, y ningún detector lo leía</w:t>
+            </w:r>
+          </w:p>
+        </w:tc>
+        <w:tc>
+          <w:tcPr>
+            <w:tcW w:type="dxa" w:w="7622"/>
+            <w:tcMar>
+              <w:top w:type="dxa" w:w="70"/>
+              <w:left w:type="dxa" w:w="100"/>
+              <w:bottom w:type="dxa" w:w="70"/>
+              <w:right w:type="dxa" w:w="100"/>
+            </w:tcMar>
+          </w:tcPr>
+          <w:p>
+            <w:pPr>
+              <w:spacing w:after="40"/>
+            </w:pPr>
+            <w:r>
+              <w:rPr>
+                <w:rFonts w:ascii="Aptos" w:cs="Aptos" w:eastAsia="Aptos" w:hAnsi="Aptos"/>
+                <w:b w:val="false"/>
+                <w:bCs w:val="false"/>
+                <w:color w:val="6B6B6B"/>
+                <w:sz w:val="16"/>
+                <w:szCs w:val="16"/>
+              </w:rPr>
+              <w:t xml:space="preserve">El bloque ns-web2-api de integrate.py quedó dentro de las comillas triples de _headers: no corría y contaminaba publish/_headers. Se vio integrando; web-tests r27-e comprueba ahora la gramática de _headers y _redirects.</w:t>
+            </w:r>
+          </w:p>
+        </w:tc>
+      </w:tr>
+      <w:tr>
+        <w:trPr>
+          <w:cantSplit/>
+        </w:trPr>
+        <w:tc>
+          <w:tcPr>
+            <w:tcW w:type="dxa" w:w="2678"/>
+            <w:tcMar>
+              <w:top w:type="dxa" w:w="70"/>
+              <w:left w:type="dxa" w:w="100"/>
+              <w:bottom w:type="dxa" w:w="70"/>
+              <w:right w:type="dxa" w:w="100"/>
+            </w:tcMar>
+          </w:tcPr>
+          <w:p>
+            <w:pPr>
+              <w:spacing w:after="40"/>
+            </w:pPr>
+            <w:r>
+              <w:rPr>
+                <w:rFonts w:ascii="Aptos" w:cs="Aptos" w:eastAsia="Aptos" w:hAnsi="Aptos"/>
+                <w:b/>
+                <w:bCs/>
+                <w:color w:val="6B6B6B"/>
+                <w:sz w:val="16"/>
+                <w:szCs w:val="16"/>
+              </w:rPr>
+              <w:t xml:space="preserve">La verificación se escribe con los nombres reales, no con la abreviatura de la memoria</w:t>
+            </w:r>
+          </w:p>
+        </w:tc>
+        <w:tc>
+          <w:tcPr>
+            <w:tcW w:type="dxa" w:w="7622"/>
+            <w:tcMar>
+              <w:top w:type="dxa" w:w="70"/>
+              <w:left w:type="dxa" w:w="100"/>
+              <w:bottom w:type="dxa" w:w="70"/>
+              <w:right w:type="dxa" w:w="100"/>
+            </w:tcMar>
+          </w:tcPr>
+          <w:p>
+            <w:pPr>
+              <w:spacing w:after="40"/>
+            </w:pPr>
+            <w:r>
+              <w:rPr>
+                <w:rFonts w:ascii="Aptos" w:cs="Aptos" w:eastAsia="Aptos" w:hAnsi="Aptos"/>
+                <w:b w:val="false"/>
+                <w:bCs w:val="false"/>
+                <w:color w:val="6B6B6B"/>
+                <w:sz w:val="16"/>
+                <w:szCs w:val="16"/>
+              </w:rPr>
+              <w:t xml:space="preserve">«admins * waitlist» no existía; las policies son waitlist_admin_* y «admins … waitlist». Se leen de los create policy del histórico (o de pg_policies) antes de contarlas.</w:t>
+            </w:r>
+          </w:p>
+        </w:tc>
+      </w:tr>
+      <w:tr>
+        <w:trPr>
+          <w:cantSplit/>
+        </w:trPr>
+        <w:tc>
+          <w:tcPr>
+            <w:tcW w:type="dxa" w:w="2678"/>
+            <w:tcMar>
+              <w:top w:type="dxa" w:w="70"/>
+              <w:left w:type="dxa" w:w="100"/>
+              <w:bottom w:type="dxa" w:w="70"/>
+              <w:right w:type="dxa" w:w="100"/>
+            </w:tcMar>
+          </w:tcPr>
+          <w:p>
+            <w:pPr>
+              <w:spacing w:after="40"/>
+            </w:pPr>
+            <w:r>
+              <w:rPr>
+                <w:rFonts w:ascii="Aptos" w:cs="Aptos" w:eastAsia="Aptos" w:hAnsi="Aptos"/>
+                <w:b/>
+                <w:bCs/>
+                <w:color w:val="6B6B6B"/>
+                <w:sz w:val="16"/>
+                <w:szCs w:val="16"/>
+              </w:rPr>
+              <w:t xml:space="preserve">El editor de Supabase no conserva estado de sesión entre sentencias</w:t>
+            </w:r>
+          </w:p>
+        </w:tc>
+        <w:tc>
+          <w:tcPr>
+            <w:tcW w:type="dxa" w:w="7622"/>
+            <w:tcMar>
+              <w:top w:type="dxa" w:w="70"/>
+              <w:left w:type="dxa" w:w="100"/>
+              <w:bottom w:type="dxa" w:w="70"/>
+              <w:right w:type="dxa" w:w="100"/>
+            </w:tcMar>
+          </w:tcPr>
+          <w:p>
+            <w:pPr>
+              <w:spacing w:after="40"/>
+            </w:pPr>
+            <w:r>
+              <w:rPr>
+                <w:rFonts w:ascii="Aptos" w:cs="Aptos" w:eastAsia="Aptos" w:hAnsi="Aptos"/>
+                <w:b w:val="false"/>
+                <w:bCs w:val="false"/>
+                <w:color w:val="6B6B6B"/>
+                <w:sz w:val="16"/>
+                <w:szCs w:val="16"/>
+              </w:rPr>
+              <w:t xml:space="preserve">Una temp table creada en una sentencia no existe en la siguiente (42P01). begin;/commit; y set local sueltos no encadenan nada: la atomicidad existe solo dentro de una sentencia (un do $$ … $$). Corrige la lección del 26-sep; el arnés PG16 abre una conexión por sentencia.</w:t>
+            </w:r>
+          </w:p>
+        </w:tc>
+      </w:tr>
+      <w:tr>
+        <w:trPr>
+          <w:cantSplit/>
+        </w:trPr>
+        <w:tc>
+          <w:tcPr>
+            <w:tcW w:type="dxa" w:w="2678"/>
+            <w:tcMar>
+              <w:top w:type="dxa" w:w="70"/>
+              <w:left w:type="dxa" w:w="100"/>
+              <w:bottom w:type="dxa" w:w="70"/>
+              <w:right w:type="dxa" w:w="100"/>
+            </w:tcMar>
+          </w:tcPr>
+          <w:p>
+            <w:pPr>
+              <w:spacing w:after="40"/>
+            </w:pPr>
+            <w:r>
+              <w:rPr>
+                <w:rFonts w:ascii="Aptos" w:cs="Aptos" w:eastAsia="Aptos" w:hAnsi="Aptos"/>
+                <w:b/>
+                <w:bCs/>
+                <w:color w:val="6B6B6B"/>
+                <w:sz w:val="16"/>
+                <w:szCs w:val="16"/>
+              </w:rPr>
+              <w:t xml:space="preserve">Todo lo que huele a persona se casa, no se borra</w:t>
+            </w:r>
+          </w:p>
+        </w:tc>
+        <w:tc>
+          <w:tcPr>
+            <w:tcW w:type="dxa" w:w="7622"/>
+            <w:tcMar>
+              <w:top w:type="dxa" w:w="70"/>
+              <w:left w:type="dxa" w:w="100"/>
+              <w:bottom w:type="dxa" w:w="70"/>
+              <w:right w:type="dxa" w:w="100"/>
+            </w:tcMar>
+          </w:tcPr>
+          <w:p>
+            <w:pPr>
+              <w:spacing w:after="40"/>
+            </w:pPr>
+            <w:r>
+              <w:rPr>
+                <w:rFonts w:ascii="Aptos" w:cs="Aptos" w:eastAsia="Aptos" w:hAnsi="Aptos"/>
+                <w:b w:val="false"/>
+                <w:bCs w:val="false"/>
+                <w:color w:val="6B6B6B"/>
+                <w:sz w:val="16"/>
+                <w:szCs w:val="16"/>
+              </w:rPr>
+              <w:t xml:space="preserve">La app solo se instala desde TestFlight/Play: una cuenta «sin casar» es casi siempre una tester ya invitada con otro correo (relay de Apple). 💍 Casar une los dos correos sin perder nada; borrar solo para lo que no es nadie (15 cuentas de prueba y typos del login de App Review).</w:t>
+            </w:r>
+          </w:p>
+        </w:tc>
+      </w:tr>
+    </w:tbl>
+    <w:p>
+      <w:pPr>
+        <w:pStyle w:val="Heading1"/>
+        <w:spacing w:after="160" w:before="320"/>
+      </w:pPr>
+      <w:r>
+        <w:rPr>
+          <w:rFonts w:ascii="Aptos" w:cs="Aptos" w:eastAsia="Aptos" w:hAnsi="Aptos"/>
+          <w:b/>
+          <w:bCs/>
+          <w:color w:val="E8502A"/>
+          <w:sz w:val="30"/>
+          <w:szCs w:val="30"/>
+        </w:rPr>
+        <w:t xml:space="preserve">9 · La cadena</w:t>
       </w:r>
     </w:p>
     <w:tbl>
@@ -5285,7 +5794,7 @@
                 <w:sz w:val="16"/>
                 <w:szCs w:val="16"/>
               </w:rPr>
-              <w:t xml:space="preserve">A (S19): SQL (ritmo + cierre REST) · Edge `waitlist-join` · Pages Function · web2 (formulario + Turnstile) · integrate.py (`ns-waitlist-js`, lista blanca) · founder-reminders · sonda. B (tras WL-2): SQL (columnas, count, admin, 168) · Edge `waitlist-confirm-drain` + `waitlist-confirm` + cron · Pages Function `/confirm` · página de confirmación web2 (5 idiomas) · 📬 insignia · digest.</w:t>
+              <w:t xml:space="preserve">A: HECHO (26-sep noche): SQL ritmo + cierre REST + vigilancia · Edge waitlist-join · Pages Function · web2 (formulario + Turnstile, 5 idiomas) · integrate.py (ns-web2-api, ns-waitlist-js, _routes) · founder-reminders · sondas. B (tras WL-2): SQL (columnas, count, admin, 168) · Edge waitlist-confirm-drain + waitlist-confirm + cron · Pages Function /confirm · página de confirmación web2 (5 idiomas) · 📬 insignia · digest.</w:t>
             </w:r>
           </w:p>
         </w:tc>
@@ -5344,7 +5853,7 @@
                 <w:sz w:val="16"/>
                 <w:szCs w:val="16"/>
               </w:rPr>
-              <w:t xml:space="preserve">Arnés de puras · arnés PG16 (A: policy; B: purga y count en los cuatro estados) · web-tests · verify-web2 + textfit · pre-deploy · estreno real por cada camino (B: UN correo, mirado en la bandeja).</w:t>
+              <w:t xml:space="preserve">A: HECHO — arnés de puras (9/9) · arnés PG16 (6 escenarios + fixture con service_role bypassrls) · forms-test 11/11 (jsdom) · web-tests 95/95 · verify-web2 + textfit ×5 · pre-deploy todo verde · estreno real por cada camino en producción. B: pendiente.</w:t>
             </w:r>
           </w:p>
         </w:tc>
@@ -5403,7 +5912,7 @@
                 <w:sz w:val="16"/>
                 <w:szCs w:val="16"/>
               </w:rPr>
-              <w:t xml:space="preserve">A · orden C8/D10: SQL ritmo → secrets + Deploy Edge → variable Pages → web2 candidata → verificada → integrate → Deploy Web → smoke → SQL cierre REST → smoke. B · SQL columnas → Deploy Edge (confirm + drain, verificados en vivo) → cron → web2 (página de confirmación) → integrate → Deploy Web → estreno real.</w:t>
+              <w:t xml:space="preserve">A: HECHO el 27-sep 00:40 en el orden C8/D10 (ritmo → Edge → Pages/Turnstile/WAF → candidata verificada → po258 → smoke → cierre REST → smoke → vigilancia → digest). B: pendiente de WL-2.</w:t>
             </w:r>
           </w:p>
         </w:tc>
@@ -5462,7 +5971,7 @@
                 <w:sz w:val="16"/>
                 <w:szCs w:val="16"/>
               </w:rPr>
-              <w:t xml:space="preserve">DoD de A y de B arriba (técnica + Lucía y Pilar desde sus móviles + digest del día siguiente).</w:t>
+              <w:t xml:space="preserve">A: técnica HECHA (veredictos, smoke 401, sondas: ritmo·true, 8 policies de admins, digest v4). Humana pendiente: digest del 27-sep 07:15 con 📬; Lucía y Pilar se apuntan desde el móvil (DoD).</w:t>
             </w:r>
           </w:p>
         </w:tc>
@@ -5521,7 +6030,7 @@
                 <w:sz w:val="16"/>
                 <w:szCs w:val="16"/>
               </w:rPr>
-              <w:t xml:space="preserve">Hub: este doc 54 + adjunto (po256); as-built al cerrar cada entrega. Notion: sin bloques → hub.</w:t>
+              <w:t xml:space="preserve">Hub: doc 54 (as-built A, po259) + adjuntos; tablero: item A hecho, item B en backlog bloqueado por WL-2, 3 items nuevos (2026-09-27-cierre-ust19-a-tablero.sql). Notion: sin bloques → hub.</w:t>
             </w:r>
           </w:p>
         </w:tc>
@@ -5734,7 +6243,7 @@
                 <w:sz w:val="16"/>
                 <w:szCs w:val="16"/>
               </w:rPr>
-              <w:t xml:space="preserve">Ingeniería y producto (D1–D10 y D14, carril técnico)</w:t>
+              <w:t xml:space="preserve">Ingeniería y producto (D1–D10 y D14 firmados el 26-sep · as-built de la entrega A: firma pendiente)</w:t>
             </w:r>
           </w:p>
         </w:tc>
@@ -6031,7 +6540,7 @@
           <w:sz w:val="16"/>
           <w:szCs w:val="16"/>
         </w:rPr>
-        <w:t xml:space="preserve">NutriSync Engineering · 26 de septiembre de 2026 · UST-2026-09-26-19</w:t>
+        <w:t xml:space="preserve">NutriSync Engineering · 27 de septiembre de 2026 · UST-2026-09-26-19</w:t>
       </w:r>
     </w:p>
     <w:sectPr>

</xml_diff>